<commit_message>
Informes actualizados, plantillas demo y README con guía
</commit_message>
<xml_diff>
--- a/docs/informes/Informe_Semana_1_Cimientos.docx
+++ b/docs/informes/Informe_Semana_1_Cimientos.docx
@@ -1968,7 +1968,7 @@
           <w:rFonts w:ascii="Arial" w:cs="Arial" w:eastAsia="Arial" w:hAnsi="Arial"/>
           <w:color w:val="26232F"/>
         </w:rPr>
-        <w:t xml:space="preserve">, que crea la base de datos, las tablas con sus claves foráneas y carga datos de ejemplo: el usuario administrador, la configuración con la paleta de Pixela, 4 páginas (Inicio, Servicios, Plantillas y Contacto), el menú con submenús y 20 bloques de contenido. La contraseña del administrador se guarda cifrada con bcrypt.</w:t>
+        <w:t xml:space="preserve">, que crea la base de datos, las tablas con sus claves foráneas y carga datos de ejemplo: el usuario administrador, la configuración con la paleta de Pixela, 4 páginas (Inicio, Servicios, Plantillas y Contacto), el menú con submenús, 20 bloques de contenido y 11 imágenes de ejemplo ya procesadas. La contraseña del administrador se guarda cifrada con bcrypt.</w:t>
       </w:r>
     </w:p>
     <w:tbl>
@@ -3480,7 +3480,7 @@
           <w:rFonts w:ascii="Arial" w:cs="Arial" w:eastAsia="Arial" w:hAnsi="Arial"/>
           <w:color w:val="26232F"/>
         </w:rPr>
-        <w:t xml:space="preserve"> que explica cómo instalarlo en 3 pasos. La carpeta </w:t>
+        <w:t xml:space="preserve"> que explica la instalación paso a paso (requisitos, dónde copiar la carpeta, cómo encender XAMPP y ejecutar el instalador) y una tabla con soluciones a los problemas más comunes. La carpeta </w:t>
       </w:r>
       <w:r>
         <w:rPr>
@@ -3498,6 +3498,36 @@
           <w:color w:val="26232F"/>
         </w:rPr>
         <w:t xml:space="preserve"> sí se sube para que el profesor no necesite instalar Composer.</w:t>
+      </w:r>
+    </w:p>
+    <w:p>
+      <w:pPr>
+        <w:spacing w:after="160" w:line="310"/>
+        <w:jc w:val="both"/>
+      </w:pPr>
+      <w:r>
+        <w:rPr>
+          <w:rFonts w:ascii="Arial" w:cs="Arial" w:eastAsia="Arial" w:hAnsi="Arial"/>
+          <w:color w:val="26232F"/>
+        </w:rPr>
+        <w:t xml:space="preserve">También dejé claro en el README que para compartir el proyecto hay que usar el ZIP de GitHub: así no viaja el </w:t>
+      </w:r>
+      <w:r>
+        <w:rPr>
+          <w:rFonts w:ascii="Consolas" w:cs="Consolas" w:eastAsia="Consolas" w:hAnsi="Consolas"/>
+          <w:color w:val="26232F"/>
+          <w:sz w:val="19"/>
+          <w:szCs w:val="19"/>
+          <w:shd w:fill="F3EEFF" w:val="clear"/>
+        </w:rPr>
+        <w:t xml:space="preserve">.env</w:t>
+      </w:r>
+      <w:r>
+        <w:rPr>
+          <w:rFonts w:ascii="Arial" w:cs="Arial" w:eastAsia="Arial" w:hAnsi="Arial"/>
+          <w:color w:val="26232F"/>
+        </w:rPr>
+        <w:t xml:space="preserve"> de mi computadora y el sistema se instala limpio en cualquier PC con XAMPP, sin importar el nombre de la carpeta.</w:t>
       </w:r>
     </w:p>
     <w:p>

</xml_diff>

<commit_message>
Informes con datos del estudiante y redacción final
</commit_message>
<xml_diff>
--- a/docs/informes/Informe_Semana_1_Cimientos.docx
+++ b/docs/informes/Informe_Semana_1_Cimientos.docx
@@ -323,7 +323,7 @@
                 <w:sz w:val="22"/>
                 <w:szCs w:val="22"/>
               </w:rPr>
-              <w:t xml:space="preserve">Mizuno</w:t>
+              <w:t xml:space="preserve">Moises Palomino Sanchez</w:t>
             </w:r>
           </w:p>
         </w:tc>
@@ -384,7 +384,7 @@
                 <w:sz w:val="22"/>
                 <w:szCs w:val="22"/>
               </w:rPr>
-              <w:t xml:space="preserve"/>
+              <w:t xml:space="preserve">David Arturo Malpartida Calixto</w:t>
             </w:r>
           </w:p>
         </w:tc>
@@ -665,7 +665,7 @@
                 <w:rFonts w:ascii="Arial" w:cs="Arial" w:eastAsia="Arial" w:hAnsi="Arial"/>
                 <w:color w:val="26232F"/>
               </w:rPr>
-              <w:t xml:space="preserve">El objetivo de esta primera semana fue dejar lista la base sobre la que se construye todo el sistema: diseñar la base de datos (DER) en tercera forma normal, levantar el servidor de la API con una estructura ordenada y crear los endpoints de autenticación con JWT guardado en una cookie segura. Además, como el profesor debe poder revisar el proyecto sin complicaciones, me propuse que el sistema se instale con un solo clic.</w:t>
+              <w:t xml:space="preserve">Esta primera semana la dediqué a los cimientos del proyecto: diseñar la base de datos, levantar el servidor de la API y hacer que el inicio de sesión funcione con JWT. Desde el principio también tuve en mente algo práctico: que el profesor pueda instalar y probar el sistema sin complicarse, así que me propuse que todo quede listo con un solo clic.</w:t>
             </w:r>
           </w:p>
         </w:tc>
@@ -705,7 +705,7 @@
           <w:rFonts w:ascii="Arial" w:cs="Arial" w:eastAsia="Arial" w:hAnsi="Arial"/>
           <w:color w:val="26232F"/>
         </w:rPr>
-        <w:t xml:space="preserve">El tema elegido es </w:t>
+        <w:t xml:space="preserve">Para el tema elegí </w:t>
       </w:r>
       <w:r>
         <w:rPr>
@@ -721,7 +721,7 @@
           <w:rFonts w:ascii="Arial" w:cs="Arial" w:eastAsia="Arial" w:hAnsi="Arial"/>
           <w:color w:val="26232F"/>
         </w:rPr>
-        <w:t xml:space="preserve">, mi marca como desarrollador freelance. Pixela es un estudio digital que ofrece páginas web, branding, manejo de redes y sistemas a medida, y además vende plantillas web por rubro (restaurante, clínica, tienda, etc.). El CMS sirve para que el dueño del estudio cambie la web completa (logo, colores, menú y contenido) desde un panel, sin tocar código.</w:t>
+        <w:t xml:space="preserve">, que es el nombre que uso para mis trabajos de diseño web como freelance. La idea es que Pixela funcione como un estudio digital que ofrece páginas web, branding, manejo de redes y sistemas a medida, y que además venda plantillas web ya listas por rubro. El CMS es justamente la herramienta con la que el dueño del estudio puede cambiar su web (logo, colores, menú y contenido) sin tener que tocar código.</w:t>
       </w:r>
     </w:p>
     <w:p>
@@ -734,7 +734,7 @@
           <w:rFonts w:ascii="Arial" w:cs="Arial" w:eastAsia="Arial" w:hAnsi="Arial"/>
           <w:color w:val="26232F"/>
         </w:rPr>
-        <w:t xml:space="preserve">La guía indica que las tecnologías son opcionales, así que trabajé con </w:t>
+        <w:t xml:space="preserve">La guía dice que las tecnologías son opcionales, así que decidí trabajar con </w:t>
       </w:r>
       <w:r>
         <w:rPr>
@@ -750,7 +750,7 @@
           <w:rFonts w:ascii="Arial" w:cs="Arial" w:eastAsia="Arial" w:hAnsi="Arial"/>
           <w:color w:val="26232F"/>
         </w:rPr>
-        <w:t xml:space="preserve"> sobre XAMPP, que es lo que más domino y lo que el profesor ya tiene instalado. Igual respeté cada requisito técnico con su equivalente:</w:t>
+        <w:t xml:space="preserve"> sobre XAMPP. Es lo que más domino y, además, es lo que normalmente ya está instalado en las máquinas del laboratorio. Eso sí, me aseguré de cumplir cada requisito técnico con su equivalente:</w:t>
       </w:r>
     </w:p>
     <w:tbl>
@@ -804,7 +804,7 @@
                 <w:sz w:val="17"/>
                 <w:szCs w:val="17"/>
               </w:rPr>
-              <w:t xml:space="preserve">REQUISITO DE LA GUÍA</w:t>
+              <w:t xml:space="preserve">LO QUE PIDE LA GUÍA</w:t>
             </w:r>
           </w:p>
         </w:tc>
@@ -908,7 +908,7 @@
                 <w:sz w:val="19"/>
                 <w:szCs w:val="19"/>
               </w:rPr>
-              <w:t xml:space="preserve">MySQL / MariaDB con columna </w:t>
+              <w:t xml:space="preserve">MySQL / MariaDB con una columna </w:t>
             </w:r>
             <w:r>
               <w:rPr>
@@ -1329,7 +1329,7 @@
                 <w:sz w:val="19"/>
                 <w:szCs w:val="19"/>
               </w:rPr>
-              <w:t xml:space="preserve">Librería GD de PHP (se hace en la semana 2)</w:t>
+              <w:t xml:space="preserve">Librería GD de PHP (la trabajé en la semana 2)</w:t>
             </w:r>
           </w:p>
         </w:tc>
@@ -1396,7 +1396,7 @@
           <w:rFonts w:ascii="Arial" w:cs="Arial" w:eastAsia="Arial" w:hAnsi="Arial"/>
           <w:color w:val="26232F"/>
         </w:rPr>
-        <w:t xml:space="preserve">Primero identifiqué qué información necesita el sistema y la separé en tablas para no repetir datos. Quedaron </w:t>
+        <w:t xml:space="preserve">Antes de escribir una sola línea de código me senté a pensar qué datos iba a necesitar el sistema y cómo separarlos para no repetir información. Al final quedaron </w:t>
       </w:r>
       <w:r>
         <w:rPr>
@@ -1565,7 +1565,7 @@
           <w:rFonts w:ascii="Arial" w:cs="Arial" w:eastAsia="Arial" w:hAnsi="Arial"/>
           <w:color w:val="26232F"/>
         </w:rPr>
-        <w:t xml:space="preserve">.</w:t>
+        <w:t xml:space="preserve">. Las más importantes son estas:</w:t>
       </w:r>
     </w:p>
     <w:p>
@@ -1591,7 +1591,7 @@
           <w:rFonts w:ascii="Arial" w:cs="Arial" w:eastAsia="Arial" w:hAnsi="Arial"/>
           <w:color w:val="26232F"/>
         </w:rPr>
-        <w:t xml:space="preserve"> guarda la configuración global en una sola fila: nombre, logo, favicon, los 5 colores en HEX, WhatsApp, correo y redes sociales. Le puse un </w:t>
+        <w:t xml:space="preserve"> guarda la configuración de todo el sitio en una sola fila: nombre, logo, favicon, los 5 colores en HEX, WhatsApp, correo y redes sociales. Le agregué un </w:t>
       </w:r>
       <w:r>
         <w:rPr>
@@ -1608,7 +1608,7 @@
           <w:rFonts w:ascii="Arial" w:cs="Arial" w:eastAsia="Arial" w:hAnsi="Arial"/>
           <w:color w:val="26232F"/>
         </w:rPr>
-        <w:t xml:space="preserve"> para que nunca haya dos configuraciones.</w:t>
+        <w:t xml:space="preserve"> para que nunca se cree una segunda configuración por error.</w:t>
       </w:r>
     </w:p>
     <w:p>
@@ -1634,7 +1634,7 @@
           <w:rFonts w:ascii="Arial" w:cs="Arial" w:eastAsia="Arial" w:hAnsi="Arial"/>
           <w:color w:val="26232F"/>
         </w:rPr>
-        <w:t xml:space="preserve"> es la tabla modular del constructor de páginas: cada bloque tiene su tipo (hero, servicios, planes, etc.), su orden, si está visible y su contenido en una columna </w:t>
+        <w:t xml:space="preserve"> es la tabla de los bloques. Cada bloque tiene su tipo (portada, servicios, planes, etc.), su orden, si se ve o no, y su contenido en una columna </w:t>
       </w:r>
       <w:r>
         <w:rPr>
@@ -1650,7 +1650,7 @@
           <w:rFonts w:ascii="Arial" w:cs="Arial" w:eastAsia="Arial" w:hAnsi="Arial"/>
           <w:color w:val="26232F"/>
         </w:rPr>
-        <w:t xml:space="preserve">. Así se pueden agregar tipos de bloque nuevos sin cambiar la base de datos.</w:t>
+        <w:t xml:space="preserve">. Lo bueno de esto es que puedo inventar tipos de bloque nuevos sin tener que cambiar la base de datos.</w:t>
       </w:r>
     </w:p>
     <w:p>
@@ -1693,7 +1693,7 @@
           <w:rFonts w:ascii="Arial" w:cs="Arial" w:eastAsia="Arial" w:hAnsi="Arial"/>
           <w:color w:val="26232F"/>
         </w:rPr>
-        <w:t xml:space="preserve"> que apunta a la misma tabla para permitir submenús, y puede enlazar a una página interna o a una URL.</w:t>
+        <w:t xml:space="preserve"> que apunta a la misma tabla; así se pueden hacer submenús. Cada ítem puede llevar a una página del sitio o a un enlace externo.</w:t>
       </w:r>
     </w:p>
     <w:p>
@@ -1710,7 +1710,7 @@
           <w:rFonts w:ascii="Arial" w:cs="Arial" w:eastAsia="Arial" w:hAnsi="Arial"/>
           <w:color w:val="26232F"/>
         </w:rPr>
-        <w:t xml:space="preserve">Las imágenes se guardan en </w:t>
+        <w:t xml:space="preserve">Las imágenes van en </w:t>
       </w:r>
       <w:r>
         <w:rPr>
@@ -1727,7 +1727,7 @@
           <w:rFonts w:ascii="Arial" w:cs="Arial" w:eastAsia="Arial" w:hAnsi="Arial"/>
           <w:color w:val="26232F"/>
         </w:rPr>
-        <w:t xml:space="preserve"> y sus versiones reducidas (480, 768 y 1280 px) en </w:t>
+        <w:t xml:space="preserve"> y sus versiones más livianas (480, 768 y 1280 px) en </w:t>
       </w:r>
       <w:r>
         <w:rPr>
@@ -1744,7 +1744,7 @@
           <w:rFonts w:ascii="Arial" w:cs="Arial" w:eastAsia="Arial" w:hAnsi="Arial"/>
           <w:color w:val="26232F"/>
         </w:rPr>
-        <w:t xml:space="preserve">, en lugar de repetir columnas.</w:t>
+        <w:t xml:space="preserve">, en vez de poner una columna por cada tamaño.</w:t>
       </w:r>
     </w:p>
     <w:p>
@@ -1882,7 +1882,7 @@
           <w:rFonts w:ascii="Arial" w:cs="Arial" w:eastAsia="Arial" w:hAnsi="Arial"/>
           <w:color w:val="26232F"/>
         </w:rPr>
-        <w:t xml:space="preserve">Para validar la 3FN revisé que cada tabla tenga una clave primaria, que no haya grupos repetidos (por eso las variantes de imagen van aparte) y que ningún campo dependa de otro que no sea la clave (el nombre del rol vive en </w:t>
+        <w:t xml:space="preserve">Para revisar la tercera forma normal me fijé en tres cosas: que cada tabla tenga su clave primaria, que no haya datos repetidos en grupos (por eso las variantes de imagen están en otra tabla) y que ningún campo dependa de algo que no sea la clave (por ejemplo, el nombre del rol está en </w:t>
       </w:r>
       <w:r>
         <w:rPr>
@@ -1899,24 +1899,7 @@
           <w:rFonts w:ascii="Arial" w:cs="Arial" w:eastAsia="Arial" w:hAnsi="Arial"/>
           <w:color w:val="26232F"/>
         </w:rPr>
-        <w:t xml:space="preserve">, no en </w:t>
-      </w:r>
-      <w:r>
-        <w:rPr>
-          <w:rFonts w:ascii="Consolas" w:cs="Consolas" w:eastAsia="Consolas" w:hAnsi="Consolas"/>
-          <w:color w:val="26232F"/>
-          <w:sz w:val="19"/>
-          <w:szCs w:val="19"/>
-          <w:shd w:fill="F3EEFF" w:val="clear"/>
-        </w:rPr>
-        <w:t xml:space="preserve">usuarios</w:t>
-      </w:r>
-      <w:r>
-        <w:rPr>
-          <w:rFonts w:ascii="Arial" w:cs="Arial" w:eastAsia="Arial" w:hAnsi="Arial"/>
-          <w:color w:val="26232F"/>
-        </w:rPr>
-        <w:t xml:space="preserve">). El único dato no atómico es el contenido de los bloques, y eso es justo lo que pide la guía: datos estructurados en JSON.</w:t>
+        <w:t xml:space="preserve"> y no copiado en cada usuario). Lo único que no es atómico es el contenido de los bloques, pero eso es precisamente lo que pide la guía.</w:t>
       </w:r>
     </w:p>
     <w:p>
@@ -1951,7 +1934,7 @@
           <w:rFonts w:ascii="Arial" w:cs="Arial" w:eastAsia="Arial" w:hAnsi="Arial"/>
           <w:color w:val="26232F"/>
         </w:rPr>
-        <w:t xml:space="preserve">Escribí el archivo </w:t>
+        <w:t xml:space="preserve">Luego escribí el archivo </w:t>
       </w:r>
       <w:r>
         <w:rPr>
@@ -1968,7 +1951,7 @@
           <w:rFonts w:ascii="Arial" w:cs="Arial" w:eastAsia="Arial" w:hAnsi="Arial"/>
           <w:color w:val="26232F"/>
         </w:rPr>
-        <w:t xml:space="preserve">, que crea la base de datos, las tablas con sus claves foráneas y carga datos de ejemplo: el usuario administrador, la configuración con la paleta de Pixela, 4 páginas (Inicio, Servicios, Plantillas y Contacto), el menú con submenús, 20 bloques de contenido y 11 imágenes de ejemplo ya procesadas. La contraseña del administrador se guarda cifrada con bcrypt.</w:t>
+        <w:t xml:space="preserve">. Este script crea la base de datos con todas sus tablas y relaciones, y de paso carga datos de ejemplo para que el sistema no se vea vacío: el usuario administrador, la paleta de colores de Pixela, 4 páginas (Inicio, Servicios, Plantillas y Contacto), el menú con submenús, 20 bloques de contenido y 11 imágenes de ejemplo. La contraseña del administrador no se guarda tal cual, sino cifrada con bcrypt.</w:t>
       </w:r>
     </w:p>
     <w:tbl>
@@ -2173,7 +2156,7 @@
           <w:rFonts w:ascii="Arial" w:cs="Arial" w:eastAsia="Arial" w:hAnsi="Arial"/>
           <w:color w:val="26232F"/>
         </w:rPr>
-        <w:t xml:space="preserve">Armé la API con una estructura parecida a Express, pero en PHP. Todas las peticiones entran por </w:t>
+        <w:t xml:space="preserve">Para la API quise copiar la forma de trabajar de Express, pero en PHP. Todas las peticiones entran por un solo archivo, </w:t>
       </w:r>
       <w:r>
         <w:rPr>
@@ -2190,7 +2173,7 @@
           <w:rFonts w:ascii="Arial" w:cs="Arial" w:eastAsia="Arial" w:hAnsi="Arial"/>
           <w:color w:val="26232F"/>
         </w:rPr>
-        <w:t xml:space="preserve"> gracias a un </w:t>
+        <w:t xml:space="preserve">, gracias a un </w:t>
       </w:r>
       <w:r>
         <w:rPr>
@@ -2207,7 +2190,7 @@
           <w:rFonts w:ascii="Arial" w:cs="Arial" w:eastAsia="Arial" w:hAnsi="Arial"/>
           <w:color w:val="26232F"/>
         </w:rPr>
-        <w:t xml:space="preserve">, y un </w:t>
+        <w:t xml:space="preserve">. Ahí un </w:t>
       </w:r>
       <w:r>
         <w:rPr>
@@ -2216,14 +2199,14 @@
           <w:bCs/>
           <w:color w:val="26232F"/>
         </w:rPr>
-        <w:t xml:space="preserve">router propio</w:t>
-      </w:r>
-      <w:r>
-        <w:rPr>
-          <w:rFonts w:ascii="Arial" w:cs="Arial" w:eastAsia="Arial" w:hAnsi="Arial"/>
-          <w:color w:val="26232F"/>
-        </w:rPr>
-        <w:t xml:space="preserve"> decide qué controlador atiende cada ruta, incluso con parámetros como </w:t>
+        <w:t xml:space="preserve">router</w:t>
+      </w:r>
+      <w:r>
+        <w:rPr>
+          <w:rFonts w:ascii="Arial" w:cs="Arial" w:eastAsia="Arial" w:hAnsi="Arial"/>
+          <w:color w:val="26232F"/>
+        </w:rPr>
+        <w:t xml:space="preserve"> que hice yo mismo revisa la ruta y decide qué controlador la atiende, incluso cuando la ruta trae parámetros como </w:t>
       </w:r>
       <w:r>
         <w:rPr>
@@ -2240,7 +2223,7 @@
           <w:rFonts w:ascii="Arial" w:cs="Arial" w:eastAsia="Arial" w:hAnsi="Arial"/>
           <w:color w:val="26232F"/>
         </w:rPr>
-        <w:t xml:space="preserve">. Cada controlador solo recibe la petición y responde; la lógica y las consultas a la base de datos están en los servicios. Todas las respuestas tienen el mismo formato JSON:</w:t>
+        <w:t xml:space="preserve">. Los controladores solo reciben la petición y devuelven la respuesta; las consultas y la lógica están en los servicios. Para que todo sea ordenado, todas las respuestas tienen el mismo formato:</w:t>
       </w:r>
     </w:p>
     <w:tbl>
@@ -2325,7 +2308,7 @@
           <w:rFonts w:ascii="Arial" w:cs="Arial" w:eastAsia="Arial" w:hAnsi="Arial"/>
           <w:color w:val="26232F"/>
         </w:rPr>
-        <w:t xml:space="preserve">Para la conexión usé PDO con sentencias preparadas (evita inyección SQL), y los datos sensibles como la contraseña de la base de datos y la clave del JWT se leen de un archivo </w:t>
+        <w:t xml:space="preserve">La conexión a la base de datos la hice con PDO y sentencias preparadas, que es lo que evita la inyección SQL. Los datos delicados, como la contraseña de la base de datos y la clave del JWT, no están escritos en el código: se leen de un archivo </w:t>
       </w:r>
       <w:r>
         <w:rPr>
@@ -2342,7 +2325,7 @@
           <w:rFonts w:ascii="Arial" w:cs="Arial" w:eastAsia="Arial" w:hAnsi="Arial"/>
           <w:color w:val="26232F"/>
         </w:rPr>
-        <w:t xml:space="preserve"> que no se sube al repositorio. En el repositorio va un </w:t>
+        <w:t xml:space="preserve"> que no se sube al repositorio. En su lugar subí un </w:t>
       </w:r>
       <w:r>
         <w:rPr>
@@ -2359,7 +2342,7 @@
           <w:rFonts w:ascii="Arial" w:cs="Arial" w:eastAsia="Arial" w:hAnsi="Arial"/>
           <w:color w:val="26232F"/>
         </w:rPr>
-        <w:t xml:space="preserve"> como plantilla.</w:t>
+        <w:t xml:space="preserve"> como modelo.</w:t>
       </w:r>
     </w:p>
     <w:p>
@@ -2519,7 +2502,7 @@
           <w:rFonts w:ascii="Arial" w:cs="Arial" w:eastAsia="Arial" w:hAnsi="Arial"/>
           <w:color w:val="26232F"/>
         </w:rPr>
-        <w:t xml:space="preserve">Creé tres endpoints de autenticación: </w:t>
+        <w:t xml:space="preserve">Después vino el inicio de sesión. Hice tres endpoints: </w:t>
       </w:r>
       <w:r>
         <w:rPr>
@@ -2570,7 +2553,7 @@
           <w:rFonts w:ascii="Arial" w:cs="Arial" w:eastAsia="Arial" w:hAnsi="Arial"/>
           <w:color w:val="26232F"/>
         </w:rPr>
-        <w:t xml:space="preserve">. Al iniciar sesión, el servicio busca al usuario, compara la contraseña con </w:t>
+        <w:t xml:space="preserve">. Cuando alguien inicia sesión, el servicio busca el usuario, compara la contraseña con </w:t>
       </w:r>
       <w:r>
         <w:rPr>
@@ -2587,7 +2570,7 @@
           <w:rFonts w:ascii="Arial" w:cs="Arial" w:eastAsia="Arial" w:hAnsi="Arial"/>
           <w:color w:val="26232F"/>
         </w:rPr>
-        <w:t xml:space="preserve"> y, si es correcta, genera un </w:t>
+        <w:t xml:space="preserve"> y, si todo está bien, genera un </w:t>
       </w:r>
       <w:r>
         <w:rPr>
@@ -2603,7 +2586,7 @@
           <w:rFonts w:ascii="Arial" w:cs="Arial" w:eastAsia="Arial" w:hAnsi="Arial"/>
           <w:color w:val="26232F"/>
         </w:rPr>
-        <w:t xml:space="preserve"> firmado (HS256) que dura 8 horas. El token no se devuelve en el cuerpo de la respuesta: se guarda en la cookie </w:t>
+        <w:t xml:space="preserve"> firmado que dura 8 horas. Algo que aprendí aquí es que el token no conviene devolverlo en la respuesta para guardarlo en JavaScript: lo guardo en la cookie </w:t>
       </w:r>
       <w:r>
         <w:rPr>
@@ -2620,7 +2603,7 @@
           <w:rFonts w:ascii="Arial" w:cs="Arial" w:eastAsia="Arial" w:hAnsi="Arial"/>
           <w:color w:val="26232F"/>
         </w:rPr>
-        <w:t xml:space="preserve"> con las opciones </w:t>
+        <w:t xml:space="preserve"> con </w:t>
       </w:r>
       <w:r>
         <w:rPr>
@@ -2637,7 +2620,7 @@
           <w:rFonts w:ascii="Arial" w:cs="Arial" w:eastAsia="Arial" w:hAnsi="Arial"/>
           <w:color w:val="26232F"/>
         </w:rPr>
-        <w:t xml:space="preserve"> (JavaScript no puede leerla) y </w:t>
+        <w:t xml:space="preserve">, para que ningún script pueda leerla, y con </w:t>
       </w:r>
       <w:r>
         <w:rPr>
@@ -2654,7 +2637,7 @@
           <w:rFonts w:ascii="Arial" w:cs="Arial" w:eastAsia="Arial" w:hAnsi="Arial"/>
           <w:color w:val="26232F"/>
         </w:rPr>
-        <w:t xml:space="preserve"> (el navegador no la envía desde otros sitios).</w:t>
+        <w:t xml:space="preserve">, para que el navegador no la mande desde otras páginas.</w:t>
       </w:r>
     </w:p>
     <w:p>
@@ -2667,7 +2650,7 @@
           <w:rFonts w:ascii="Arial" w:cs="Arial" w:eastAsia="Arial" w:hAnsi="Arial"/>
           <w:color w:val="26232F"/>
         </w:rPr>
-        <w:t xml:space="preserve">Después hice el </w:t>
+        <w:t xml:space="preserve">Con eso listo hice el </w:t>
       </w:r>
       <w:r>
         <w:rPr>
@@ -2684,7 +2667,7 @@
           <w:rFonts w:ascii="Arial" w:cs="Arial" w:eastAsia="Arial" w:hAnsi="Arial"/>
           <w:color w:val="26232F"/>
         </w:rPr>
-        <w:t xml:space="preserve">, que lee la cookie, valida la firma y la fecha de expiración, y revisa el rol del usuario. Así cada ruta puede pedir “cualquier usuario logueado”, “editor o admin” o “solo admin”.</w:t>
+        <w:t xml:space="preserve">. Este lee la cookie, comprueba la firma y la fecha de vencimiento, y revisa el rol. Así puedo decir, ruta por ruta, si la puede usar cualquier usuario con sesión, solo un editor o administrador, o solo el administrador.</w:t>
       </w:r>
     </w:p>
     <w:p>
@@ -3094,7 +3077,7 @@
           <w:rFonts w:ascii="Arial" w:cs="Arial" w:eastAsia="Arial" w:hAnsi="Arial"/>
           <w:color w:val="26232F"/>
         </w:rPr>
-        <w:t xml:space="preserve">Como el profesor tiene que probar el proyecto, hice un instalador web (</w:t>
+        <w:t xml:space="preserve">Pensando en la revisión, hice un instalador web (</w:t>
       </w:r>
       <w:r>
         <w:rPr>
@@ -3111,7 +3094,7 @@
           <w:rFonts w:ascii="Arial" w:cs="Arial" w:eastAsia="Arial" w:hAnsi="Arial"/>
           <w:color w:val="26232F"/>
         </w:rPr>
-        <w:t xml:space="preserve">) para que no tenga que importar la base de datos a mano ni editar archivos. El instalador revisa los requisitos del servidor (versión de PHP, PDO, GD, librería JWT, permisos), crea la base de datos con los datos de ejemplo y genera el archivo </w:t>
+        <w:t xml:space="preserve">) para que no haya que importar la base de datos a mano ni editar archivos. Primero revisa que el servidor tenga lo necesario (versión de PHP, PDO, GD, la librería JWT y permisos de escritura). Después crea la base de datos con los datos de ejemplo y genera el </w:t>
       </w:r>
       <w:r>
         <w:rPr>
@@ -3128,7 +3111,7 @@
           <w:rFonts w:ascii="Arial" w:cs="Arial" w:eastAsia="Arial" w:hAnsi="Arial"/>
           <w:color w:val="26232F"/>
         </w:rPr>
-        <w:t xml:space="preserve"> con una clave JWT aleatoria. Con XAMPP solo hay que pulsar </w:t>
+        <w:t xml:space="preserve"> con una clave JWT aleatoria. Con XAMPP encendido solo hay que pulsar </w:t>
       </w:r>
       <w:r>
         <w:rPr>
@@ -3144,7 +3127,7 @@
           <w:rFonts w:ascii="Arial" w:cs="Arial" w:eastAsia="Arial" w:hAnsi="Arial"/>
           <w:color w:val="26232F"/>
         </w:rPr>
-        <w:t xml:space="preserve">. Si alguien lo vuelve a abrir, pide confirmar antes de borrar los datos.</w:t>
+        <w:t xml:space="preserve">. Y si alguien lo vuelve a abrir más adelante, pide confirmar antes de borrar los datos, para que nadie pierda su información sin querer.</w:t>
       </w:r>
     </w:p>
     <w:p>
@@ -3429,7 +3412,7 @@
           <w:rFonts w:ascii="Arial" w:cs="Arial" w:eastAsia="Arial" w:hAnsi="Arial"/>
           <w:color w:val="26232F"/>
         </w:rPr>
-        <w:t xml:space="preserve">Subí el proyecto a GitHub con un </w:t>
+        <w:t xml:space="preserve">Por último subí el proyecto a GitHub. El </w:t>
       </w:r>
       <w:r>
         <w:rPr>
@@ -3446,7 +3429,7 @@
           <w:rFonts w:ascii="Arial" w:cs="Arial" w:eastAsia="Arial" w:hAnsi="Arial"/>
           <w:color w:val="26232F"/>
         </w:rPr>
-        <w:t xml:space="preserve"> que excluye el </w:t>
+        <w:t xml:space="preserve"> deja fuera el </w:t>
       </w:r>
       <w:r>
         <w:rPr>
@@ -3463,7 +3446,7 @@
           <w:rFonts w:ascii="Arial" w:cs="Arial" w:eastAsia="Arial" w:hAnsi="Arial"/>
           <w:color w:val="26232F"/>
         </w:rPr>
-        <w:t xml:space="preserve"> y las imágenes subidas, y con un </w:t>
+        <w:t xml:space="preserve"> y las imágenes que se suban, pero sí incluye la carpeta </w:t>
       </w:r>
       <w:r>
         <w:rPr>
@@ -3473,14 +3456,14 @@
           <w:szCs w:val="19"/>
           <w:shd w:fill="F3EEFF" w:val="clear"/>
         </w:rPr>
-        <w:t xml:space="preserve">README.md</w:t>
-      </w:r>
-      <w:r>
-        <w:rPr>
-          <w:rFonts w:ascii="Arial" w:cs="Arial" w:eastAsia="Arial" w:hAnsi="Arial"/>
-          <w:color w:val="26232F"/>
-        </w:rPr>
-        <w:t xml:space="preserve"> que explica la instalación paso a paso (requisitos, dónde copiar la carpeta, cómo encender XAMPP y ejecutar el instalador) y una tabla con soluciones a los problemas más comunes. La carpeta </w:t>
+        <w:t xml:space="preserve">vendor/</w:t>
+      </w:r>
+      <w:r>
+        <w:rPr>
+          <w:rFonts w:ascii="Arial" w:cs="Arial" w:eastAsia="Arial" w:hAnsi="Arial"/>
+          <w:color w:val="26232F"/>
+        </w:rPr>
+        <w:t xml:space="preserve">, para que el profesor no tenga que instalar Composer. En el </w:t>
       </w:r>
       <w:r>
         <w:rPr>
@@ -3490,14 +3473,14 @@
           <w:szCs w:val="19"/>
           <w:shd w:fill="F3EEFF" w:val="clear"/>
         </w:rPr>
-        <w:t xml:space="preserve">vendor/</w:t>
-      </w:r>
-      <w:r>
-        <w:rPr>
-          <w:rFonts w:ascii="Arial" w:cs="Arial" w:eastAsia="Arial" w:hAnsi="Arial"/>
-          <w:color w:val="26232F"/>
-        </w:rPr>
-        <w:t xml:space="preserve"> sí se sube para que el profesor no necesite instalar Composer.</w:t>
+        <w:t xml:space="preserve">README.md</w:t>
+      </w:r>
+      <w:r>
+        <w:rPr>
+          <w:rFonts w:ascii="Arial" w:cs="Arial" w:eastAsia="Arial" w:hAnsi="Arial"/>
+          <w:color w:val="26232F"/>
+        </w:rPr>
+        <w:t xml:space="preserve"> expliqué la instalación paso a paso (qué se necesita, dónde copiar la carpeta, cómo encender XAMPP y abrir el instalador) y agregué una tabla con soluciones a los problemas más comunes.</w:t>
       </w:r>
     </w:p>
     <w:p>
@@ -3510,7 +3493,7 @@
           <w:rFonts w:ascii="Arial" w:cs="Arial" w:eastAsia="Arial" w:hAnsi="Arial"/>
           <w:color w:val="26232F"/>
         </w:rPr>
-        <w:t xml:space="preserve">También dejé claro en el README que para compartir el proyecto hay que usar el ZIP de GitHub: así no viaja el </w:t>
+        <w:t xml:space="preserve">También dejé anotado que, para compartir el proyecto, lo mejor es usar el ZIP que da GitHub. Así no viaja el </w:t>
       </w:r>
       <w:r>
         <w:rPr>
@@ -3527,7 +3510,7 @@
           <w:rFonts w:ascii="Arial" w:cs="Arial" w:eastAsia="Arial" w:hAnsi="Arial"/>
           <w:color w:val="26232F"/>
         </w:rPr>
-        <w:t xml:space="preserve"> de mi computadora y el sistema se instala limpio en cualquier PC con XAMPP, sin importar el nombre de la carpeta.</w:t>
+        <w:t xml:space="preserve"> de mi computadora y el sistema se instala limpio en cualquier PC con XAMPP, se llame como se llame la carpeta.</w:t>
       </w:r>
     </w:p>
     <w:p>
@@ -4446,6 +4429,19 @@
         <w:t xml:space="preserve">   Problemas encontrados y soluciones</w:t>
       </w:r>
     </w:p>
+    <w:p>
+      <w:pPr>
+        <w:spacing w:after="160" w:line="310"/>
+        <w:jc w:val="both"/>
+      </w:pPr>
+      <w:r>
+        <w:rPr>
+          <w:rFonts w:ascii="Arial" w:cs="Arial" w:eastAsia="Arial" w:hAnsi="Arial"/>
+          <w:color w:val="26232F"/>
+        </w:rPr>
+        <w:t xml:space="preserve">No todo salió a la primera. Estos fueron los inconvenientes de la semana y cómo los resolví:</w:t>
+      </w:r>
+    </w:p>
     <w:tbl>
       <w:tblPr>
         <w:tblW w:type="dxa" w:w="9638"/>
@@ -4569,7 +4565,7 @@
                 <w:sz w:val="19"/>
                 <w:szCs w:val="19"/>
               </w:rPr>
-              <w:t xml:space="preserve">Composer bloqueó la instalación de </w:t>
+              <w:t xml:space="preserve">Composer no me dejó instalar </w:t>
             </w:r>
             <w:r>
               <w:rPr>
@@ -4588,7 +4584,7 @@
                 <w:sz w:val="19"/>
                 <w:szCs w:val="19"/>
               </w:rPr>
-              <w:t xml:space="preserve"> v6 por un aviso de seguridad.</w:t>
+              <w:t xml:space="preserve"> v6 porque tenía un aviso de seguridad.</w:t>
             </w:r>
           </w:p>
         </w:tc>
@@ -4620,7 +4616,7 @@
                 <w:sz w:val="19"/>
                 <w:szCs w:val="19"/>
               </w:rPr>
-              <w:t xml:space="preserve">Actualicé a la versión 7.2, que corrige el problema. Esta versión exige una clave de al menos 32 caracteres, así que el instalador genera una de 64.</w:t>
+              <w:t xml:space="preserve">Pasé a la versión 7.2, que ya lo corrige. Esta versión pide una clave de al menos 32 caracteres, así que el instalador genera una de 64.</w:t>
             </w:r>
           </w:p>
         </w:tc>
@@ -4676,7 +4672,7 @@
                 <w:sz w:val="19"/>
                 <w:szCs w:val="19"/>
               </w:rPr>
-              <w:t xml:space="preserve"> y el script fallaba.</w:t>
+              <w:t xml:space="preserve"> y el script se caía.</w:t>
             </w:r>
           </w:p>
         </w:tc>
@@ -4708,7 +4704,7 @@
                 <w:sz w:val="19"/>
                 <w:szCs w:val="19"/>
               </w:rPr>
-              <w:t xml:space="preserve">Cambié el script para usar </w:t>
+              <w:t xml:space="preserve">Cambié el script para que use </w:t>
             </w:r>
             <w:r>
               <w:rPr>
@@ -4727,7 +4723,7 @@
                 <w:sz w:val="19"/>
                 <w:szCs w:val="19"/>
               </w:rPr>
-              <w:t xml:space="preserve"> y borrar solo las tablas.</w:t>
+              <w:t xml:space="preserve"> y borre solo las tablas.</w:t>
             </w:r>
           </w:p>
         </w:tc>
@@ -4764,7 +4760,7 @@
                 <w:sz w:val="19"/>
                 <w:szCs w:val="19"/>
               </w:rPr>
-              <w:t xml:space="preserve">Las tildes y la ñ se veían mal en los datos de ejemplo.</w:t>
+              <w:t xml:space="preserve">Las tildes y la ñ de los datos de ejemplo salían con símbolos raros.</w:t>
             </w:r>
           </w:p>
         </w:tc>
@@ -4852,7 +4848,7 @@
                 <w:sz w:val="19"/>
                 <w:szCs w:val="19"/>
               </w:rPr>
-              <w:t xml:space="preserve">En algunos XAMPP la extensión GD viene desactivada.</w:t>
+              <w:t xml:space="preserve">En algunos XAMPP la extensión GD viene apagada.</w:t>
             </w:r>
           </w:p>
         </w:tc>
@@ -4884,7 +4880,7 @@
                 <w:sz w:val="19"/>
                 <w:szCs w:val="19"/>
               </w:rPr>
-              <w:t xml:space="preserve">El instalador lo detecta y avisa cómo activarla en php.ini, sin bloquear la instalación.</w:t>
+              <w:t xml:space="preserve">El instalador lo detecta y explica cómo activarla en php.ini, pero no bloquea la instalación.</w:t>
             </w:r>
           </w:p>
         </w:tc>
@@ -4921,7 +4917,7 @@
                 <w:sz w:val="19"/>
                 <w:szCs w:val="19"/>
               </w:rPr>
-              <w:t xml:space="preserve">Al clonar el repositorio desde la terminal se creó en C:\Windows\System32.</w:t>
+              <w:t xml:space="preserve">La primera vez que cloné el repositorio, se me creó dentro de C:\Windows\System32.</w:t>
             </w:r>
           </w:p>
         </w:tc>
@@ -4953,7 +4949,7 @@
                 <w:sz w:val="19"/>
                 <w:szCs w:val="19"/>
               </w:rPr>
-              <w:t xml:space="preserve">Aprendí a moverme primero a la carpeta correcta (</w:t>
+              <w:t xml:space="preserve">Aprendí que antes de clonar hay que ir a la carpeta correcta con </w:t>
             </w:r>
             <w:r>
               <w:rPr>
@@ -4972,7 +4968,7 @@
                 <w:sz w:val="19"/>
                 <w:szCs w:val="19"/>
               </w:rPr>
-              <w:t xml:space="preserve">) antes de clonar.</w:t>
+              <w:t xml:space="preserve">.</w:t>
             </w:r>
           </w:p>
         </w:tc>
@@ -5009,19 +5005,15 @@
     </w:p>
     <w:p>
       <w:pPr>
-        <w:pStyle w:val="ListParagraph"/>
-        <w:numPr>
-          <w:ilvl w:val="0"/>
-          <w:numId w:val="2"/>
-        </w:numPr>
-        <w:spacing w:after="90" w:line="300"/>
-      </w:pPr>
-      <w:r>
-        <w:rPr>
-          <w:rFonts w:ascii="Arial" w:cs="Arial" w:eastAsia="Arial" w:hAnsi="Arial"/>
-          <w:color w:val="26232F"/>
-        </w:rPr>
-        <w:t xml:space="preserve">Dedicar tiempo al DER al inicio ahorra problemas después: con </w:t>
+        <w:spacing w:after="160" w:line="310"/>
+        <w:jc w:val="both"/>
+      </w:pPr>
+      <w:r>
+        <w:rPr>
+          <w:rFonts w:ascii="Arial" w:cs="Arial" w:eastAsia="Arial" w:hAnsi="Arial"/>
+          <w:color w:val="26232F"/>
+        </w:rPr>
+        <w:t xml:space="preserve">Lo que más me quedó de esta semana es que vale la pena darle tiempo al DER antes de programar. Al dejar </w:t>
       </w:r>
       <w:r>
         <w:rPr>
@@ -5055,58 +5047,33 @@
           <w:rFonts w:ascii="Arial" w:cs="Arial" w:eastAsia="Arial" w:hAnsi="Arial"/>
           <w:color w:val="26232F"/>
         </w:rPr>
-        <w:t xml:space="preserve"> en JSON, el resto del sistema se puede volver administrable sin cambiar el esquema.</w:t>
+        <w:t xml:space="preserve"> con contenido en JSON, ya tenía resuelto cómo hacer administrable la web más adelante, sin tener que cambiar las tablas a cada rato.</w:t>
       </w:r>
     </w:p>
     <w:p>
       <w:pPr>
-        <w:pStyle w:val="ListParagraph"/>
-        <w:numPr>
-          <w:ilvl w:val="0"/>
-          <w:numId w:val="2"/>
-        </w:numPr>
-        <w:spacing w:after="90" w:line="300"/>
-      </w:pPr>
-      <w:r>
-        <w:rPr>
-          <w:rFonts w:ascii="Arial" w:cs="Arial" w:eastAsia="Arial" w:hAnsi="Arial"/>
-          <w:color w:val="26232F"/>
-        </w:rPr>
-        <w:t xml:space="preserve">Guardar el JWT en una cookie HttpOnly es más seguro que en localStorage, porque un script malicioso no puede robarlo.</w:t>
+        <w:spacing w:after="160" w:line="310"/>
+        <w:jc w:val="both"/>
+      </w:pPr>
+      <w:r>
+        <w:rPr>
+          <w:rFonts w:ascii="Arial" w:cs="Arial" w:eastAsia="Arial" w:hAnsi="Arial"/>
+          <w:color w:val="26232F"/>
+        </w:rPr>
+        <w:t xml:space="preserve">También entendí mejor por qué se recomienda guardar el JWT en una cookie HttpOnly y no en el localStorage: si alguien llegara a meter un script en la página, igual no podría robar la sesión. Y separar controladores y servicios me ayudó a tener el código más ordenado y fácil de revisar.</w:t>
       </w:r>
     </w:p>
     <w:p>
       <w:pPr>
-        <w:pStyle w:val="ListParagraph"/>
-        <w:numPr>
-          <w:ilvl w:val="0"/>
-          <w:numId w:val="2"/>
-        </w:numPr>
-        <w:spacing w:after="90" w:line="300"/>
-      </w:pPr>
-      <w:r>
-        <w:rPr>
-          <w:rFonts w:ascii="Arial" w:cs="Arial" w:eastAsia="Arial" w:hAnsi="Arial"/>
-          <w:color w:val="26232F"/>
-        </w:rPr>
-        <w:t xml:space="preserve">Separar controladores y servicios hace que el código sea más fácil de leer y de probar.</w:t>
-      </w:r>
-    </w:p>
-    <w:p>
-      <w:pPr>
-        <w:pStyle w:val="ListParagraph"/>
-        <w:numPr>
-          <w:ilvl w:val="0"/>
-          <w:numId w:val="2"/>
-        </w:numPr>
-        <w:spacing w:after="90" w:line="300"/>
-      </w:pPr>
-      <w:r>
-        <w:rPr>
-          <w:rFonts w:ascii="Arial" w:cs="Arial" w:eastAsia="Arial" w:hAnsi="Arial"/>
-          <w:color w:val="26232F"/>
-        </w:rPr>
-        <w:t xml:space="preserve">El instalador facilita mucho la revisión: con XAMPP encendido, el sistema queda listo en un clic.</w:t>
+        <w:spacing w:after="160" w:line="310"/>
+        <w:jc w:val="both"/>
+      </w:pPr>
+      <w:r>
+        <w:rPr>
+          <w:rFonts w:ascii="Arial" w:cs="Arial" w:eastAsia="Arial" w:hAnsi="Arial"/>
+          <w:color w:val="26232F"/>
+        </w:rPr>
+        <w:t xml:space="preserve">Finalmente, el instalador fue una buena decisión: con XAMPP encendido, el sistema queda funcionando en un clic, que es justo lo que buscaba para que la revisión sea sencilla.</w:t>
       </w:r>
     </w:p>
     <w:sectPr>

</xml_diff>

<commit_message>
Frontend con Bootstrap 5.3 en la web y el panel
</commit_message>
<xml_diff>
--- a/docs/informes/Informe_Semana_1_Cimientos.docx
+++ b/docs/informes/Informe_Semana_1_Cimientos.docx
@@ -1330,6 +1330,95 @@
                 <w:szCs w:val="19"/>
               </w:rPr>
               <w:t xml:space="preserve">Librería GD de PHP (la trabajé en la semana 2)</w:t>
+            </w:r>
+          </w:p>
+        </w:tc>
+      </w:tr>
+      <w:tr>
+        <w:trPr>
+          <w:cantSplit/>
+        </w:trPr>
+        <w:tc>
+          <w:tcPr>
+            <w:tcW w:type="dxa" w:w="4200"/>
+            <w:tcBorders>
+              <w:top w:val="none" w:color="FFFFFF" w:sz="0"/>
+              <w:left w:val="none" w:color="FFFFFF" w:sz="0"/>
+              <w:bottom w:val="single" w:color="DCD3F5" w:sz="4"/>
+              <w:right w:val="none" w:color="FFFFFF" w:sz="0"/>
+            </w:tcBorders>
+            <w:shd w:fill="FAF8FF" w:val="clear"/>
+            <w:tcMar>
+              <w:top w:type="dxa" w:w="90"/>
+              <w:left w:type="dxa" w:w="140"/>
+              <w:bottom w:type="dxa" w:w="90"/>
+              <w:right w:type="dxa" w:w="140"/>
+            </w:tcMar>
+          </w:tcPr>
+          <w:p>
+            <w:pPr>
+              <w:spacing w:after="0" w:line="270"/>
+            </w:pPr>
+            <w:r>
+              <w:rPr>
+                <w:rFonts w:ascii="Arial" w:cs="Arial" w:eastAsia="Arial" w:hAnsi="Arial"/>
+                <w:color w:val="26232F"/>
+                <w:sz w:val="19"/>
+                <w:szCs w:val="19"/>
+              </w:rPr>
+              <w:t xml:space="preserve">Next.js + Tailwind (frontend)</w:t>
+            </w:r>
+          </w:p>
+        </w:tc>
+        <w:tc>
+          <w:tcPr>
+            <w:tcW w:type="dxa" w:w="5438"/>
+            <w:tcBorders>
+              <w:top w:val="none" w:color="FFFFFF" w:sz="0"/>
+              <w:left w:val="none" w:color="FFFFFF" w:sz="0"/>
+              <w:bottom w:val="single" w:color="DCD3F5" w:sz="4"/>
+              <w:right w:val="none" w:color="FFFFFF" w:sz="0"/>
+            </w:tcBorders>
+            <w:shd w:fill="FAF8FF" w:val="clear"/>
+            <w:tcMar>
+              <w:top w:type="dxa" w:w="90"/>
+              <w:left w:type="dxa" w:w="140"/>
+              <w:bottom w:type="dxa" w:w="90"/>
+              <w:right w:type="dxa" w:w="140"/>
+            </w:tcMar>
+          </w:tcPr>
+          <w:p>
+            <w:pPr>
+              <w:spacing w:after="0" w:line="270"/>
+            </w:pPr>
+            <w:r>
+              <w:rPr>
+                <w:rFonts w:ascii="Arial" w:cs="Arial" w:eastAsia="Arial" w:hAnsi="Arial"/>
+                <w:color w:val="26232F"/>
+                <w:sz w:val="19"/>
+                <w:szCs w:val="19"/>
+              </w:rPr>
+              <w:t xml:space="preserve">Framework </w:t>
+            </w:r>
+            <w:r>
+              <w:rPr>
+                <w:rFonts w:ascii="Arial" w:cs="Arial" w:eastAsia="Arial" w:hAnsi="Arial"/>
+                <w:b/>
+                <w:bCs/>
+                <w:color w:val="26232F"/>
+                <w:sz w:val="19"/>
+                <w:szCs w:val="19"/>
+              </w:rPr>
+              <w:t xml:space="preserve">Bootstrap 5.3</w:t>
+            </w:r>
+            <w:r>
+              <w:rPr>
+                <w:rFonts w:ascii="Arial" w:cs="Arial" w:eastAsia="Arial" w:hAnsi="Arial"/>
+                <w:color w:val="26232F"/>
+                <w:sz w:val="19"/>
+                <w:szCs w:val="19"/>
+              </w:rPr>
+              <w:t xml:space="preserve"> en la web pública y el panel (semanas 3 y 4)</w:t>
             </w:r>
           </w:p>
         </w:tc>

</xml_diff>